<commit_message>
Keep rows from drifting; always load fresh panel files; add test page
- Remove top/bottom cell padding (Word for Mac can add it on top of the
  exact 1in row height) and set the bottom page margin to 0 for room.
- Panel loads its scripts and styles with a fresh address on every open.
- New 'Make a test page' button builds an outlined, numbered page to
  print on plain paper.

Co-Authored-By: Claude Opus 5.5 <noreply@anthropic.com>
</commit_message>
<xml_diff>
--- a/templates/avery-5160.docx
+++ b/templates/avery-5160.docx
@@ -16,9 +16,9 @@
         </w:tblBorders>
         <w:tblLayout w:type="fixed"/>
         <w:tblCellMar>
-          <w:top w:w="43" w:type="dxa"/>
+          <w:top w:w="0" w:type="dxa"/>
           <w:left w:w="144" w:type="dxa"/>
-          <w:bottom w:w="43" w:type="dxa"/>
+          <w:bottom w:w="0" w:type="dxa"/>
           <w:right w:w="144" w:type="dxa"/>
         </w:tblCellMar>
       </w:tblPr>
@@ -732,7 +732,7 @@
     </w:p>
     <w:sectPr>
       <w:pgSz w:w="12240" w:h="15840"/>
-      <w:pgMar w:top="720" w:right="270" w:bottom="288" w:left="270" w:header="0" w:footer="0" w:gutter="0"/>
+      <w:pgMar w:top="720" w:right="270" w:bottom="0" w:left="270" w:header="0" w:footer="0" w:gutter="0"/>
       <w:cols w:space="720"/>
     </w:sectPr>
   </w:body>

</xml_diff>

<commit_message>
Sideways shipping sheet, address label builder, and label file import
- Shipping labels (2 per sheet) now show as a sideways page with two
  upright 5.5x8.5 labels; text starts 0.45in below the top edge.
- Panel: put an Amazon/carrier label PDF or picture on the next open
  label (crop, auto-turn, sized to fit), or build a From / Ship to
  address label with a remembered return address.
- Bundle Mozilla PDF.js 3.11.174 (Apache 2.0) to read label PDFs.

Co-Authored-By: Claude Opus 5.5 <noreply@anthropic.com>
</commit_message>
<xml_diff>
--- a/templates/avery-5160.docx
+++ b/templates/avery-5160.docx
@@ -760,6 +760,15 @@
     <w:name w:val="Normal"/>
     <w:qFormat/>
   </w:style>
+  <w:style w:type="paragraph" w:customStyle="1" w:styleId="LabelTop">
+    <w:name w:val="Label first line"/>
+    <w:basedOn w:val="Normal"/>
+    <w:next w:val="Normal"/>
+    <w:qFormat/>
+    <w:pPr>
+      <w:spacing w:before="576"/>
+    </w:pPr>
+  </w:style>
   <w:style w:type="table" w:default="1" w:styleId="TableNormal">
     <w:name w:val="Normal Table"/>
     <w:uiPriority w:val="99"/>

</xml_diff>

<commit_message>
Keep shipping and full-sheet labels on one page
With top and bottom margins of 0, Word for Mac makes room for an empty
header and footer, which pushed full-height labels onto a second page.
New sheets get a 1-point header and footer; the panel shrinks empty ones
on older sheets.

Co-Authored-By: Claude Opus 5.5 <noreply@anthropic.com>
</commit_message>
<xml_diff>
--- a/templates/avery-5160.docx
+++ b/templates/avery-5160.docx
@@ -750,12 +750,27 @@
     </w:p>
     <w:sectPr>
       <w:headerReference w:type="default" r:id="rId3"/>
+      <w:footerReference w:type="default" r:id="rId4"/>
       <w:pgSz w:w="12240" w:h="15840"/>
       <w:pgMar w:top="461" w:right="270" w:bottom="0" w:left="270" w:header="0" w:footer="0" w:gutter="0"/>
       <w:cols w:space="720"/>
     </w:sectPr>
   </w:body>
 </w:document>
+</file>
+
+<file path=word/footer1.xml><?xml version="1.0" encoding="utf-8"?>
+<w:ftr xmlns:w="http://schemas.openxmlformats.org/wordprocessingml/2006/main" xmlns:r="http://schemas.openxmlformats.org/officeDocument/2006/relationships">
+  <w:p>
+    <w:pPr>
+      <w:spacing w:before="0" w:after="0" w:line="20" w:lineRule="exact"/>
+      <w:rPr>
+        <w:sz w:val="2"/>
+        <w:szCs w:val="2"/>
+      </w:rPr>
+    </w:pPr>
+  </w:p>
+</w:ftr>
 </file>
 
 <file path=word/header1.xml><?xml version="1.0" encoding="utf-8"?>

</xml_diff>